<commit_message>
Đẩy lại lớp 1, 2, 4 sau khi vá cột nội dung tích hợp tuần 1 và tuần 2
Ngày dạy đầu tiên của năm học: Tiếng Việt 1 hết lệch dòng, Tiếng Việt 2 có nội
dung tích hợp cho hai tiết Đọc mở rộng, Toán 4 có nội dung cho Bài 4 tiết 3.
Đo lại 51 môn của 5 khối trên cả hai website: khớp app từng dòng.

Co-Authored-By: Claude Opus 5 <noreply@anthropic.com>
Claude-Session: https://claude.ai/code/session_014D76GgQQbsQdmm4NwMTfXA
</commit_message>
<xml_diff>
--- a/assets/docs/lop1/Tieng Viet - Lop 1.docx
+++ b/assets/docs/lop1/Tieng Viet - Lop 1.docx
@@ -653,45 +653,6 @@
               <w:t>NLS-AT: Clip quay HS chỉ dùng trong lớp rồi xoá, không đăng lên mạng</w:t>
             </w:r>
           </w:p>
-          <w:p>
-            <w:pPr>
-              <w:spacing w:after="0"/>
-            </w:pPr>
-            <w:r>
-              <w:rPr>
-                <w:b w:val="0"/>
-                <w:i w:val="0"/>
-                <w:sz w:val="18"/>
-              </w:rPr>
-              <w:t>NLS-KT (Cơ bản 1): GV chiếu phóng to tranh SGK trang 9–11 và cặp ảnh tư thế ngồi đọc, viết đúng, sai; HS chỉ bạn ngồi đúng</w:t>
-            </w:r>
-          </w:p>
-          <w:p>
-            <w:pPr>
-              <w:spacing w:after="0"/>
-            </w:pPr>
-            <w:r>
-              <w:rPr>
-                <w:b w:val="0"/>
-                <w:i w:val="0"/>
-                <w:sz w:val="18"/>
-              </w:rPr>
-              <w:t>NLS-GQVĐ (Cơ bản 1): GV chiếu bài tập tương tác hình các bạn ngồi học, HS giơ thẻ mặt cười, mặt buồn; GV chụp ảnh tư thế vài HS chiếu lên</w:t>
-            </w:r>
-          </w:p>
-          <w:p>
-            <w:pPr>
-              <w:spacing w:after="0"/>
-            </w:pPr>
-            <w:r>
-              <w:rPr>
-                <w:b w:val="0"/>
-                <w:i w:val="0"/>
-                <w:sz w:val="18"/>
-              </w:rPr>
-              <w:t>NLS-AT: Nhìn màn hình quá gần, quá lâu gây cong lưng, mỏi mắt; nghỉ mắt định kì.</w:t>
-            </w:r>
-          </w:p>
         </w:tc>
         <w:tc>
           <w:tcPr>
@@ -804,7 +765,7 @@
                 <w:i w:val="0"/>
                 <w:sz w:val="18"/>
               </w:rPr>
-              <w:t>NLS-KT (Cơ bản 1): Ở hoạt động Khám phá của bài “LÀM QUEN VỚI CÁC NÉT CƠ BẢN, CÁC CHỮ SỐ, BẢNG CHỮ CÁI VÀ DẤU THANH”</w:t>
+              <w:t>NLS-KT (Cơ bản 1): GV chiếu phóng to tranh SGK trang 9–11 và cặp ảnh tư thế ngồi đọc, viết đúng, sai; HS chỉ bạn ngồi đúng</w:t>
             </w:r>
           </w:p>
           <w:p>
@@ -817,7 +778,7 @@
                 <w:i w:val="0"/>
                 <w:sz w:val="18"/>
               </w:rPr>
-              <w:t>NLS-GQVĐ (Cơ bản 1): Ở hoạt động Luyện tập, GV mở bài tập tương tác trên máy chiếu: các nét, chữ số và dấu thanh lẫn lộn</w:t>
+              <w:t>NLS-GQVĐ (Cơ bản 1): GV chiếu bài tập tương tác hình các bạn ngồi học, HS giơ thẻ mặt cười, mặt buồn; GV chụp ảnh tư thế vài HS chiếu lên</w:t>
             </w:r>
           </w:p>
           <w:p>
@@ -830,7 +791,7 @@
                 <w:i w:val="0"/>
                 <w:sz w:val="18"/>
               </w:rPr>
-              <w:t>NLS-AT: HS xem hình động vừa đủ, GV tắt máy chiếu khi HS tô, viết để bảo vệ mắt</w:t>
+              <w:t>NLS-AT: Nhìn màn hình quá gần, quá lâu gây cong lưng, mỏi mắt; nghỉ mắt định kì.</w:t>
             </w:r>
           </w:p>
         </w:tc>
@@ -945,6 +906,33 @@
                 <w:i w:val="0"/>
                 <w:sz w:val="18"/>
               </w:rPr>
+              <w:t>NLS-KT (Cơ bản 1): Ở hoạt động Khám phá của bài “LÀM QUEN VỚI CÁC NÉT CƠ BẢN, CÁC CHỮ SỐ, BẢNG CHỮ CÁI VÀ DẤU THANH”</w:t>
+            </w:r>
+          </w:p>
+          <w:p>
+            <w:pPr>
+              <w:spacing w:after="0"/>
+            </w:pPr>
+            <w:r>
+              <w:rPr>
+                <w:b w:val="0"/>
+                <w:i w:val="0"/>
+                <w:sz w:val="18"/>
+              </w:rPr>
+              <w:t>NLS-GQVĐ (Cơ bản 1): Ở hoạt động Luyện tập, GV mở bài tập tương tác trên máy chiếu: các nét, chữ số và dấu thanh lẫn lộn</w:t>
+            </w:r>
+          </w:p>
+          <w:p>
+            <w:pPr>
+              <w:spacing w:after="0"/>
+            </w:pPr>
+            <w:r>
+              <w:rPr>
+                <w:b w:val="0"/>
+                <w:i w:val="0"/>
+                <w:sz w:val="18"/>
+              </w:rPr>
+              <w:t>NLS-AT: HS xem hình động vừa đủ, GV tắt máy chiếu khi HS tô, viết để bảo vệ mắt</w:t>
             </w:r>
           </w:p>
         </w:tc>

</xml_diff>